<commit_message>
Add readme and redo  stuff
</commit_message>
<xml_diff>
--- a/Attune_Pilotstudie_Anhang.docx
+++ b/Attune_Pilotstudie_Anhang.docx
@@ -15047,6 +15047,363 @@
       <w:r>
         <w:t xml:space="preserve">Die stärksten Zusammenhänge bestätigen das Bild: Das Erleben von algorithmischem „Festhalten" korreliert positiv mit dem wahrgenommenen Wohlbefinden bei Attune (ρ = 0.55), und Selbstbestimmung hängt eng mit der Bereitschaft zusammen, Attune dem klassischen Radio vorzuziehen (ρ = 0.79).</w:t>
       </w:r>
+    </w:p>
+    <w:p>
+      <w:pPr>
+        <w:pStyle w:val="Heading2"/>
+      </w:pPr>
+      <w:r>
+        <w:t>B.8  Beantwortung der Forschungsfrage (T1–T4)</w:t>
+      </w:r>
+    </w:p>
+    <w:p>
+      <w:r>
+        <w:rPr>
+          <w:i w:val="0"/>
+        </w:rPr>
+        <w:t>Ergänzt auf Feedback des Betreuers (04.06.2026). Die vier Teilfragen aus Kap. 4.2 werden hier mit den jeweils zugeordneten Frage-Items beantwortet; die Zuordnung der Items zu den Konstrukten aus Kap. 2.3 sowie die Umpolungsregeln sind in Abschnitt 7 des Auswertungs-Notebooks dokumentiert. Negativ formulierte Items, die gegen das jeweilige Konstrukt gerichtet sind, wurden umgepolt (R), sodass durchgängig gilt: höher = besser (Skala 1–5, Skalenmitte 3). Alle Werte deskriptiv, n = 25.</w:t>
+      </w:r>
+    </w:p>
+    <w:p>
+      <w:r>
+        <w:drawing>
+          <wp:inline xmlns:a="http://schemas.openxmlformats.org/drawingml/2006/main" xmlns:pic="http://schemas.openxmlformats.org/drawingml/2006/picture">
+            <wp:extent cx="5760000" cy="2868667"/>
+            <wp:docPr id="2" name="Picture 2"/>
+            <wp:cNvGraphicFramePr>
+              <a:graphicFrameLocks noChangeAspect="1"/>
+            </wp:cNvGraphicFramePr>
+            <a:graphic>
+              <a:graphicData uri="http://schemas.openxmlformats.org/drawingml/2006/picture">
+                <pic:pic>
+                  <pic:nvPicPr>
+                    <pic:cNvPr id="0" name="T1_autonomie.png"/>
+                    <pic:cNvPicPr/>
+                  </pic:nvPicPr>
+                  <pic:blipFill>
+                    <a:blip r:embed="rId15"/>
+                    <a:stretch>
+                      <a:fillRect/>
+                    </a:stretch>
+                  </pic:blipFill>
+                  <pic:spPr>
+                    <a:xfrm>
+                      <a:off x="0" y="0"/>
+                      <a:ext cx="5760000" cy="2868667"/>
+                    </a:xfrm>
+                    <a:prstGeom prst="rect"/>
+                  </pic:spPr>
+                </pic:pic>
+              </a:graphicData>
+            </a:graphic>
+          </wp:inline>
+        </w:drawing>
+      </w:r>
+    </w:p>
+    <w:p>
+      <w:r>
+        <w:rPr>
+          <w:i/>
+          <w:sz w:val="18"/>
+        </w:rPr>
+        <w:t>Abbildung B.6: T1 – Präferenzbildung und Autonomie: Item-Mittelwerte zu Präferenzangabe, SDT-Autonomie und SDT-Kompetenz (Gesamt-M = 3.94).</w:t>
+      </w:r>
+    </w:p>
+    <w:p>
+      <w:r>
+        <w:rPr>
+          <w:i w:val="0"/>
+        </w:rPr>
+        <w:t>Die explizite Profilkonfiguration wird als autonomie- und kompetenzförderlich erlebt; alle Items liegen deutlich über der Skalenmitte.</w:t>
+      </w:r>
+    </w:p>
+    <w:p>
+      <w:r>
+        <w:drawing>
+          <wp:inline xmlns:a="http://schemas.openxmlformats.org/drawingml/2006/main" xmlns:pic="http://schemas.openxmlformats.org/drawingml/2006/picture">
+            <wp:extent cx="5760000" cy="3138876"/>
+            <wp:docPr id="3" name="Picture 3"/>
+            <wp:cNvGraphicFramePr>
+              <a:graphicFrameLocks noChangeAspect="1"/>
+            </wp:cNvGraphicFramePr>
+            <a:graphic>
+              <a:graphicData uri="http://schemas.openxmlformats.org/drawingml/2006/picture">
+                <pic:pic>
+                  <pic:nvPicPr>
+                    <pic:cNvPr id="0" name="T2_diversitaet.png"/>
+                    <pic:cNvPicPr/>
+                  </pic:nvPicPr>
+                  <pic:blipFill>
+                    <a:blip r:embed="rId16"/>
+                    <a:stretch>
+                      <a:fillRect/>
+                    </a:stretch>
+                  </pic:blipFill>
+                  <pic:spPr>
+                    <a:xfrm>
+                      <a:off x="0" y="0"/>
+                      <a:ext cx="5760000" cy="3138876"/>
+                    </a:xfrm>
+                    <a:prstGeom prst="rect"/>
+                  </pic:spPr>
+                </pic:pic>
+              </a:graphicData>
+            </a:graphic>
+          </wp:inline>
+        </w:drawing>
+      </w:r>
+    </w:p>
+    <w:p>
+      <w:r>
+        <w:rPr>
+          <w:i/>
+          <w:sz w:val="18"/>
+        </w:rPr>
+        <w:t>Abbildung B.7: T2 – Inhaltsdiversität und Bedürfnisgerechtigkeit: erlebte Diversität, Kontext-Passung und Belastungs-Items (Gesamt-M = 3.62, ohne Manipulation-Check).</w:t>
+      </w:r>
+    </w:p>
+    <w:p>
+      <w:r>
+        <w:rPr>
+          <w:i w:val="0"/>
+        </w:rPr>
+        <w:t>Die bewusst diversifizierte Auswahl (Coverage- und Serendipity-Pass der Kuratierungslogik) wird wahrgenommen und überwiegend als bedürfnisgerecht erlebt; der verhaltenste Wert betrifft den Unterhaltungsanteil.</w:t>
+      </w:r>
+    </w:p>
+    <w:p>
+      <w:r>
+        <w:drawing>
+          <wp:inline xmlns:a="http://schemas.openxmlformats.org/drawingml/2006/main" xmlns:pic="http://schemas.openxmlformats.org/drawingml/2006/picture">
+            <wp:extent cx="5760000" cy="2326652"/>
+            <wp:docPr id="4" name="Picture 4"/>
+            <wp:cNvGraphicFramePr>
+              <a:graphicFrameLocks noChangeAspect="1"/>
+            </wp:cNvGraphicFramePr>
+            <a:graphic>
+              <a:graphicData uri="http://schemas.openxmlformats.org/drawingml/2006/picture">
+                <pic:pic>
+                  <pic:nvPicPr>
+                    <pic:cNvPr id="0" name="T3_session.png"/>
+                    <pic:cNvPicPr/>
+                  </pic:nvPicPr>
+                  <pic:blipFill>
+                    <a:blip r:embed="rId17"/>
+                    <a:stretch>
+                      <a:fillRect/>
+                    </a:stretch>
+                  </pic:blipFill>
+                  <pic:spPr>
+                    <a:xfrm>
+                      <a:off x="0" y="0"/>
+                      <a:ext cx="5760000" cy="2326652"/>
+                    </a:xfrm>
+                    <a:prstGeom prst="rect"/>
+                  </pic:spPr>
+                </pic:pic>
+              </a:graphicData>
+            </a:graphic>
+          </wp:inline>
+        </w:drawing>
+      </w:r>
+    </w:p>
+    <w:p>
+      <w:r>
+        <w:rPr>
+          <w:i/>
+          <w:sz w:val="18"/>
+        </w:rPr>
+        <w:t>Abbildung B.8: T3 – Sessiongestaltung und Nutzungskontrolle: Session-Design-Items und Wellbeing-Erleben (Gesamt-M = 3.67).</w:t>
+      </w:r>
+    </w:p>
+    <w:p>
+      <w:r>
+        <w:rPr>
+          <w:i w:val="0"/>
+        </w:rPr>
+        <w:t>Das definierte Sessionende und die wählbare Länge werden positiv bewertet; der unmittelbare Entspannungseffekt fällt in der Erstkontakt-Situation am verhaltensten aus.</w:t>
+      </w:r>
+    </w:p>
+    <w:p>
+      <w:r>
+        <w:drawing>
+          <wp:inline xmlns:a="http://schemas.openxmlformats.org/drawingml/2006/main" xmlns:pic="http://schemas.openxmlformats.org/drawingml/2006/picture">
+            <wp:extent cx="5760000" cy="2867055"/>
+            <wp:docPr id="5" name="Picture 5"/>
+            <wp:cNvGraphicFramePr>
+              <a:graphicFrameLocks noChangeAspect="1"/>
+            </wp:cNvGraphicFramePr>
+            <a:graphic>
+              <a:graphicData uri="http://schemas.openxmlformats.org/drawingml/2006/picture">
+                <pic:pic>
+                  <pic:nvPicPr>
+                    <pic:cNvPr id="0" name="T4_transparenz.png"/>
+                    <pic:cNvPicPr/>
+                  </pic:nvPicPr>
+                  <pic:blipFill>
+                    <a:blip r:embed="rId18"/>
+                    <a:stretch>
+                      <a:fillRect/>
+                    </a:stretch>
+                  </pic:blipFill>
+                  <pic:spPr>
+                    <a:xfrm>
+                      <a:off x="0" y="0"/>
+                      <a:ext cx="5760000" cy="2867055"/>
+                    </a:xfrm>
+                    <a:prstGeom prst="rect"/>
+                  </pic:spPr>
+                </pic:pic>
+              </a:graphicData>
+            </a:graphic>
+          </wp:inline>
+        </w:drawing>
+      </w:r>
+    </w:p>
+    <w:p>
+      <w:r>
+        <w:rPr>
+          <w:i/>
+          <w:sz w:val="18"/>
+        </w:rPr>
+        <w:t>Abbildung B.9: T4 – Transparenz und Akzeptanz: Nützlichkeit der Transparenz-Elemente sowie Vertrauens- und Verständnis-Items (Gesamt-M = 3.62).</w:t>
+      </w:r>
+    </w:p>
+    <w:p>
+      <w:r>
+        <w:rPr>
+          <w:i w:val="0"/>
+        </w:rPr>
+        <w:t>Transparenz-Elemente werden als nützlich bewertet (insbesondere Quellenangaben), aber nicht durchgängig bemerkt: Quellenangaben 14/25, Themen-Begründung 8/25, KI-Pipeline 16/25. Der SUS-angelehnte Bedienbarkeits-Index liegt bei 82.5/100.</w:t>
+      </w:r>
+    </w:p>
+    <w:p>
+      <w:r>
+        <w:drawing>
+          <wp:inline xmlns:a="http://schemas.openxmlformats.org/drawingml/2006/main" xmlns:pic="http://schemas.openxmlformats.org/drawingml/2006/picture">
+            <wp:extent cx="5760000" cy="2144612"/>
+            <wp:docPr id="6" name="Picture 6"/>
+            <wp:cNvGraphicFramePr>
+              <a:graphicFrameLocks noChangeAspect="1"/>
+            </wp:cNvGraphicFramePr>
+            <a:graphic>
+              <a:graphicData uri="http://schemas.openxmlformats.org/drawingml/2006/picture">
+                <pic:pic>
+                  <pic:nvPicPr>
+                    <pic:cNvPr id="0" name="HF_synthese.png"/>
+                    <pic:cNvPicPr/>
+                  </pic:nvPicPr>
+                  <pic:blipFill>
+                    <a:blip r:embed="rId19"/>
+                    <a:stretch>
+                      <a:fillRect/>
+                    </a:stretch>
+                  </pic:blipFill>
+                  <pic:spPr>
+                    <a:xfrm>
+                      <a:off x="0" y="0"/>
+                      <a:ext cx="5760000" cy="2144612"/>
+                    </a:xfrm>
+                    <a:prstGeom prst="rect"/>
+                  </pic:spPr>
+                </pic:pic>
+              </a:graphicData>
+            </a:graphic>
+          </wp:inline>
+        </w:drawing>
+      </w:r>
+    </w:p>
+    <w:p>
+      <w:r>
+        <w:rPr>
+          <w:i/>
+          <w:sz w:val="18"/>
+        </w:rPr>
+        <w:t>Abbildung B.10: Synthese zur Hauptforschungsfrage: aggregierte Teilfragen-Scores (Mittelwert ± SD). Alle vier Teilfragen liegen über der Skalenmitte.</w:t>
+      </w:r>
+    </w:p>
+    <w:p>
+      <w:r>
+        <w:rPr>
+          <w:i w:val="0"/>
+        </w:rPr>
+        <w:t>Zusammengefasst stützen die Pilotdaten die Hauptforschungsfrage: Eine explizite, transparente Präferenzangabe wird als bedürfnisgerecht erlebt (T1, T2), und die wellbeing-orientierten Designentscheidungen (T3, T4) werden akzeptiert. Die Befunde sind als Erstkontakt-Effekte zu interpretieren (vgl. Limitationen, Kap. 10.6).</w:t>
+      </w:r>
+    </w:p>
+    <w:p>
+      <w:r>
+        <w:drawing>
+          <wp:inline xmlns:a="http://schemas.openxmlformats.org/drawingml/2006/main" xmlns:pic="http://schemas.openxmlformats.org/drawingml/2006/picture">
+            <wp:extent cx="5760000" cy="1870238"/>
+            <wp:docPr id="7" name="Picture 7"/>
+            <wp:cNvGraphicFramePr>
+              <a:graphicFrameLocks noChangeAspect="1"/>
+            </wp:cNvGraphicFramePr>
+            <a:graphic>
+              <a:graphicData uri="http://schemas.openxmlformats.org/drawingml/2006/picture">
+                <pic:pic>
+                  <pic:nvPicPr>
+                    <pic:cNvPr id="0" name="Kategorien_uebersicht.png"/>
+                    <pic:cNvPicPr/>
+                  </pic:nvPicPr>
+                  <pic:blipFill>
+                    <a:blip r:embed="rId20"/>
+                    <a:stretch>
+                      <a:fillRect/>
+                    </a:stretch>
+                  </pic:blipFill>
+                  <pic:spPr>
+                    <a:xfrm>
+                      <a:off x="0" y="0"/>
+                      <a:ext cx="5760000" cy="1870238"/>
+                    </a:xfrm>
+                    <a:prstGeom prst="rect"/>
+                  </pic:spPr>
+                </pic:pic>
+              </a:graphicData>
+            </a:graphic>
+          </wp:inline>
+        </w:drawing>
+      </w:r>
+    </w:p>
+    <w:p>
+      <w:r>
+        <w:rPr>
+          <w:i/>
+          <w:sz w:val="18"/>
+        </w:rPr>
+        <w:t>Abbildung B.11: Verdichtete Übersicht entlang der Dreiteilung der Validierung: Machbarkeit, Usability/Akzeptanz, Wirkung.</w:t>
+      </w:r>
+    </w:p>
+    <w:p>
+      <w:pPr>
+        <w:pStyle w:val="Heading2"/>
+      </w:pPr>
+      <w:r>
+        <w:t>B.9  Reproduzierbarkeit</w:t>
+      </w:r>
+    </w:p>
+    <w:p>
+      <w:r>
+        <w:rPr>
+          <w:i w:val="0"/>
+        </w:rPr>
+        <w:t>Die gesamte Auswertung ist als kommentiertes Jupyter-Notebook (Attune_Pilotstudie_Auswertung.ipynb) umgesetzt; ein HTML-Export desselben Notebooks (Attune_Pilotstudie_Auswertung.html) dient als lesbare Fassung ohne Python-Umgebung. Alle Abbildungen dieses Anhangs werden vom Notebook deterministisch aus der Rohdatendatei (Attune – Pilotstudie.csv) erzeugt und im Ordner figures/ abgelegt. Details zum Vorgehen beschreibt die README im Repository.</w:t>
+      </w:r>
+    </w:p>
+    <w:p>
+      <w:r>
+        <w:t xml:space="preserve">Quellcode des Prototyps und Auswertung: </w:t>
+      </w:r>
+      <w:hyperlink r:id="rId21">
+        <w:r>
+          <w:rPr>
+            <w:rStyle w:val="Hyperlink"/>
+            <w:color w:val="0563C1"/>
+            <w:u w:val="single"/>
+          </w:rPr>
+          <w:t>github.com/MichaelMoeckli/attune</w:t>
+        </w:r>
+      </w:hyperlink>
     </w:p>
     <w:sectPr>
       <w:headerReference w:type="default" r:id="rId7"/>

</xml_diff>